<commit_message>
OhSINT THM CTF was finished!
</commit_message>
<xml_diff>
--- a/THM_challenges/Easy/OhSINT/OhSINT_solution_documentation.docx
+++ b/THM_challenges/Easy/OhSINT/OhSINT_solution_documentation.docx
@@ -13,7 +13,6 @@
           <w:u w:val="single"/>
         </w:rPr>
       </w:pPr>
-      <w:proofErr w:type="spellStart"/>
       <w:r>
         <w:rPr>
           <w:b/>
@@ -22,18 +21,7 @@
           <w:szCs w:val="32"/>
           <w:u w:val="single"/>
         </w:rPr>
-        <w:t>OhSINT</w:t>
-      </w:r>
-      <w:proofErr w:type="spellEnd"/>
-      <w:r>
-        <w:rPr>
-          <w:b/>
-          <w:bCs/>
-          <w:sz w:val="32"/>
-          <w:szCs w:val="32"/>
-          <w:u w:val="single"/>
-        </w:rPr>
-        <w:t xml:space="preserve"> Solution Documentation</w:t>
+        <w:t>OhSINT Solution Documentation</w:t>
       </w:r>
     </w:p>
     <w:p>
@@ -90,7 +78,7 @@
           <w:noProof/>
         </w:rPr>
         <w:drawing>
-          <wp:inline distT="0" distB="0" distL="0" distR="0" wp14:anchorId="32F89451" wp14:editId="6E2D0B58">
+          <wp:inline distT="0" distB="0" distL="0" distR="0" wp14:anchorId="32F89451" wp14:editId="5642F660">
             <wp:extent cx="7556500" cy="4250690"/>
             <wp:effectExtent l="0" t="0" r="6350" b="0"/>
             <wp:docPr id="1235898204" name="תמונה 3"/>
@@ -155,15 +143,7 @@
     </w:p>
     <w:p>
       <w:r>
-        <w:t xml:space="preserve">After couple of failure tries of using the tools </w:t>
-      </w:r>
-      <w:proofErr w:type="spellStart"/>
-      <w:r>
-        <w:t>xxd</w:t>
-      </w:r>
-      <w:proofErr w:type="spellEnd"/>
-      <w:r>
-        <w:t xml:space="preserve"> and strings</w:t>
+        <w:t>After couple of failure tries of using the tools xxd and strings</w:t>
       </w:r>
       <w:r>
         <w:t>, I moved to try a new tool</w:t>
@@ -180,13 +160,8 @@
       <w:r>
         <w:t>“</w:t>
       </w:r>
-      <w:proofErr w:type="spellStart"/>
-      <w:r>
-        <w:t>exiftool</w:t>
-      </w:r>
-      <w:proofErr w:type="spellEnd"/>
-      <w:r>
-        <w:t>”</w:t>
+      <w:r>
+        <w:t>exiftool”</w:t>
       </w:r>
       <w:r>
         <w:t xml:space="preserve">. I opened its online documentation to learn more about it </w:t>
@@ -217,6 +192,9 @@
     </w:p>
     <w:p>
       <w:r>
+        <w:rPr>
+          <w:noProof/>
+        </w:rPr>
         <w:lastRenderedPageBreak/>
         <w:drawing>
           <wp:inline distT="0" distB="0" distL="0" distR="0" wp14:anchorId="6F016E6C" wp14:editId="24F61E8C">
@@ -257,15 +235,7 @@
     </w:p>
     <w:p>
       <w:r>
-        <w:t>Here I found the Copyright owner of this image who is “</w:t>
-      </w:r>
-      <w:proofErr w:type="spellStart"/>
-      <w:r>
-        <w:t>OWoodflint</w:t>
-      </w:r>
-      <w:proofErr w:type="spellEnd"/>
-      <w:r>
-        <w:t>”.</w:t>
+        <w:t>Here I found the Copyright owner of this image who is “OWoodflint”.</w:t>
       </w:r>
     </w:p>
     <w:p>
@@ -275,6 +245,9 @@
     </w:p>
     <w:p>
       <w:r>
+        <w:rPr>
+          <w:noProof/>
+        </w:rPr>
         <w:drawing>
           <wp:inline distT="0" distB="0" distL="0" distR="0" wp14:anchorId="7447116B" wp14:editId="7AB2D7A8">
             <wp:extent cx="5437341" cy="2671041"/>
@@ -319,6 +292,9 @@
     </w:p>
     <w:p>
       <w:r>
+        <w:rPr>
+          <w:noProof/>
+        </w:rPr>
         <w:lastRenderedPageBreak/>
         <w:drawing>
           <wp:inline distT="0" distB="0" distL="0" distR="0" wp14:anchorId="6B180869" wp14:editId="018DA76C">
@@ -408,11 +384,9 @@
       <w:r>
         <w:t xml:space="preserve"> a repository named “</w:t>
       </w:r>
-      <w:proofErr w:type="spellStart"/>
       <w:r>
         <w:t>people_finder</w:t>
       </w:r>
-      <w:proofErr w:type="spellEnd"/>
       <w:r>
         <w:t>”</w:t>
       </w:r>
@@ -444,6 +418,9 @@
     </w:p>
     <w:p>
       <w:r>
+        <w:rPr>
+          <w:noProof/>
+        </w:rPr>
         <w:drawing>
           <wp:inline distT="0" distB="0" distL="0" distR="0" wp14:anchorId="7C24BCAE" wp14:editId="286752C1">
             <wp:extent cx="5696444" cy="2533870"/>
@@ -506,9 +483,305 @@
         <w:t>discovered that his</w:t>
       </w:r>
       <w:r>
-        <w:t xml:space="preserve"> WIFI’s SSID using  </w:t>
-      </w:r>
-    </w:p>
+        <w:t xml:space="preserve"> WIFI’s SSID using</w:t>
+      </w:r>
+      <w:r>
+        <w:t xml:space="preserve"> the website “wigle.net”.</w:t>
+      </w:r>
+      <w:r>
+        <w:t xml:space="preserve"> In this website, I set these parameters values:</w:t>
+      </w:r>
+    </w:p>
+    <w:p>
+      <w:r>
+        <w:lastRenderedPageBreak/>
+        <w:drawing>
+          <wp:inline distT="0" distB="0" distL="0" distR="0" wp14:anchorId="3C03192F" wp14:editId="5DE9F69D">
+            <wp:extent cx="3543607" cy="4903895"/>
+            <wp:effectExtent l="0" t="0" r="0" b="0"/>
+            <wp:docPr id="781534310" name="תמונה 1"/>
+            <wp:cNvGraphicFramePr>
+              <a:graphicFrameLocks xmlns:a="http://schemas.openxmlformats.org/drawingml/2006/main" noChangeAspect="1"/>
+            </wp:cNvGraphicFramePr>
+            <a:graphic xmlns:a="http://schemas.openxmlformats.org/drawingml/2006/main">
+              <a:graphicData uri="http://schemas.openxmlformats.org/drawingml/2006/picture">
+                <pic:pic xmlns:pic="http://schemas.openxmlformats.org/drawingml/2006/picture">
+                  <pic:nvPicPr>
+                    <pic:cNvPr id="781534310" name=""/>
+                    <pic:cNvPicPr/>
+                  </pic:nvPicPr>
+                  <pic:blipFill>
+                    <a:blip r:embed="rId11"/>
+                    <a:stretch>
+                      <a:fillRect/>
+                    </a:stretch>
+                  </pic:blipFill>
+                  <pic:spPr>
+                    <a:xfrm>
+                      <a:off x="0" y="0"/>
+                      <a:ext cx="3543607" cy="4903895"/>
+                    </a:xfrm>
+                    <a:prstGeom prst="rect">
+                      <a:avLst/>
+                    </a:prstGeom>
+                  </pic:spPr>
+                </pic:pic>
+              </a:graphicData>
+            </a:graphic>
+          </wp:inline>
+        </w:drawing>
+      </w:r>
+    </w:p>
+    <w:p>
+      <w:r>
+        <w:t>And I</w:t>
+      </w:r>
+      <w:r>
+        <w:t xml:space="preserve"> found on the map the location of the WIFI access poin</w:t>
+      </w:r>
+      <w:r>
+        <w:t>t in London with this additional info about it:</w:t>
+      </w:r>
+    </w:p>
+    <w:p>
+      <w:r>
+        <w:drawing>
+          <wp:inline distT="0" distB="0" distL="0" distR="0" wp14:anchorId="6010C3DE" wp14:editId="4A7CE00B">
+            <wp:extent cx="3010161" cy="438188"/>
+            <wp:effectExtent l="0" t="0" r="0" b="0"/>
+            <wp:docPr id="1311901551" name="תמונה 1" descr="תמונה שמכילה טקסט, גופן, צילום מסך&#10;&#10;תוכן בינה מלאכותית גנרטיבית עשוי להיות שגוי."/>
+            <wp:cNvGraphicFramePr>
+              <a:graphicFrameLocks xmlns:a="http://schemas.openxmlformats.org/drawingml/2006/main" noChangeAspect="1"/>
+            </wp:cNvGraphicFramePr>
+            <a:graphic xmlns:a="http://schemas.openxmlformats.org/drawingml/2006/main">
+              <a:graphicData uri="http://schemas.openxmlformats.org/drawingml/2006/picture">
+                <pic:pic xmlns:pic="http://schemas.openxmlformats.org/drawingml/2006/picture">
+                  <pic:nvPicPr>
+                    <pic:cNvPr id="1311901551" name="תמונה 1" descr="תמונה שמכילה טקסט, גופן, צילום מסך&#10;&#10;תוכן בינה מלאכותית גנרטיבית עשוי להיות שגוי."/>
+                    <pic:cNvPicPr/>
+                  </pic:nvPicPr>
+                  <pic:blipFill>
+                    <a:blip r:embed="rId12"/>
+                    <a:stretch>
+                      <a:fillRect/>
+                    </a:stretch>
+                  </pic:blipFill>
+                  <pic:spPr>
+                    <a:xfrm>
+                      <a:off x="0" y="0"/>
+                      <a:ext cx="3010161" cy="438188"/>
+                    </a:xfrm>
+                    <a:prstGeom prst="rect">
+                      <a:avLst/>
+                    </a:prstGeom>
+                  </pic:spPr>
+                </pic:pic>
+              </a:graphicData>
+            </a:graphic>
+          </wp:inline>
+        </w:drawing>
+      </w:r>
+    </w:p>
+    <w:p>
+      <w:r>
+        <w:t>Here, I understood that the SSID of this access point is called “</w:t>
+      </w:r>
+      <w:r>
+        <w:t>UnileverWiFi</w:t>
+      </w:r>
+      <w:r>
+        <w:t>”</w:t>
+      </w:r>
+      <w:r>
+        <w:t>.</w:t>
+      </w:r>
+    </w:p>
+    <w:p>
+      <w:r>
+        <w:t xml:space="preserve">Later, I moved to search </w:t>
+      </w:r>
+      <w:r>
+        <w:t>O</w:t>
+      </w:r>
+      <w:r>
+        <w:t>Wood</w:t>
+      </w:r>
+      <w:r>
+        <w:t>f</w:t>
+      </w:r>
+      <w:r>
+        <w:t>lint’s personal email address</w:t>
+      </w:r>
+      <w:r>
+        <w:t>, but fortunately,</w:t>
+      </w:r>
+      <w:r>
+        <w:t xml:space="preserve"> I got remember that I saw his email address on the GitHub README file that I previously </w:t>
+      </w:r>
+      <w:r>
+        <w:t>mentioned</w:t>
+      </w:r>
+      <w:r>
+        <w:t>.</w:t>
+      </w:r>
+    </w:p>
+    <w:p>
+      <w:r>
+        <w:t>Subsequently</w:t>
+      </w:r>
+      <w:r>
+        <w:t xml:space="preserve">, I </w:t>
+      </w:r>
+      <w:r>
+        <w:t xml:space="preserve">opened his </w:t>
+      </w:r>
+      <w:r>
+        <w:t>W</w:t>
+      </w:r>
+      <w:r>
+        <w:t>ord</w:t>
+      </w:r>
+      <w:r>
+        <w:t>P</w:t>
+      </w:r>
+      <w:r>
+        <w:t xml:space="preserve">ress </w:t>
+      </w:r>
+      <w:r>
+        <w:t>blog and found there his message:</w:t>
+      </w:r>
+    </w:p>
+    <w:p>
+      <w:r>
+        <w:drawing>
+          <wp:inline distT="0" distB="0" distL="0" distR="0" wp14:anchorId="6F61685C" wp14:editId="4C1F3BBA">
+            <wp:extent cx="7556500" cy="1646555"/>
+            <wp:effectExtent l="0" t="0" r="6350" b="0"/>
+            <wp:docPr id="728098809" name="תמונה 1" descr="תמונה שמכילה טקסט, גופן, צילום מסך, לבן&#10;&#10;תוכן בינה מלאכותית גנרטיבית עשוי להיות שגוי."/>
+            <wp:cNvGraphicFramePr>
+              <a:graphicFrameLocks xmlns:a="http://schemas.openxmlformats.org/drawingml/2006/main" noChangeAspect="1"/>
+            </wp:cNvGraphicFramePr>
+            <a:graphic xmlns:a="http://schemas.openxmlformats.org/drawingml/2006/main">
+              <a:graphicData uri="http://schemas.openxmlformats.org/drawingml/2006/picture">
+                <pic:pic xmlns:pic="http://schemas.openxmlformats.org/drawingml/2006/picture">
+                  <pic:nvPicPr>
+                    <pic:cNvPr id="728098809" name="תמונה 1" descr="תמונה שמכילה טקסט, גופן, צילום מסך, לבן&#10;&#10;תוכן בינה מלאכותית גנרטיבית עשוי להיות שגוי."/>
+                    <pic:cNvPicPr/>
+                  </pic:nvPicPr>
+                  <pic:blipFill>
+                    <a:blip r:embed="rId13"/>
+                    <a:stretch>
+                      <a:fillRect/>
+                    </a:stretch>
+                  </pic:blipFill>
+                  <pic:spPr>
+                    <a:xfrm>
+                      <a:off x="0" y="0"/>
+                      <a:ext cx="7556500" cy="1646555"/>
+                    </a:xfrm>
+                    <a:prstGeom prst="rect">
+                      <a:avLst/>
+                    </a:prstGeom>
+                  </pic:spPr>
+                </pic:pic>
+              </a:graphicData>
+            </a:graphic>
+          </wp:inline>
+        </w:drawing>
+      </w:r>
+    </w:p>
+    <w:p>
+      <w:r>
+        <w:t>After reading this message</w:t>
+      </w:r>
+      <w:r>
+        <w:t xml:space="preserve"> I learnt </w:t>
+      </w:r>
+      <w:r>
+        <w:t xml:space="preserve">that on the holiday he </w:t>
+      </w:r>
+      <w:r>
+        <w:t>went on holiday to New York</w:t>
+      </w:r>
+      <w:r>
+        <w:t>.</w:t>
+      </w:r>
+    </w:p>
+    <w:p>
+      <w:pPr>
+        <w:rPr>
+          <w:noProof/>
+        </w:rPr>
+      </w:pPr>
+      <w:r>
+        <w:t xml:space="preserve">Later on, I </w:t>
+      </w:r>
+      <w:r>
+        <w:t xml:space="preserve">searched on the source code of the WordPress blog of the </w:t>
+      </w:r>
+      <w:r>
+        <w:t xml:space="preserve">author, and found this </w:t>
+      </w:r>
+      <w:r>
+        <w:t>tag which contained the password:</w:t>
+      </w:r>
+      <w:r>
+        <w:rPr>
+          <w:noProof/>
+        </w:rPr>
+        <w:t xml:space="preserve"> </w:t>
+      </w:r>
+      <w:r>
+        <w:drawing>
+          <wp:inline distT="0" distB="0" distL="0" distR="0" wp14:anchorId="6DA2C2E0" wp14:editId="181AFACC">
+            <wp:extent cx="4343776" cy="236240"/>
+            <wp:effectExtent l="0" t="0" r="0" b="0"/>
+            <wp:docPr id="482257880" name="תמונה 1"/>
+            <wp:cNvGraphicFramePr>
+              <a:graphicFrameLocks xmlns:a="http://schemas.openxmlformats.org/drawingml/2006/main" noChangeAspect="1"/>
+            </wp:cNvGraphicFramePr>
+            <a:graphic xmlns:a="http://schemas.openxmlformats.org/drawingml/2006/main">
+              <a:graphicData uri="http://schemas.openxmlformats.org/drawingml/2006/picture">
+                <pic:pic xmlns:pic="http://schemas.openxmlformats.org/drawingml/2006/picture">
+                  <pic:nvPicPr>
+                    <pic:cNvPr id="482257880" name=""/>
+                    <pic:cNvPicPr/>
+                  </pic:nvPicPr>
+                  <pic:blipFill>
+                    <a:blip r:embed="rId14"/>
+                    <a:stretch>
+                      <a:fillRect/>
+                    </a:stretch>
+                  </pic:blipFill>
+                  <pic:spPr>
+                    <a:xfrm>
+                      <a:off x="0" y="0"/>
+                      <a:ext cx="4343776" cy="236240"/>
+                    </a:xfrm>
+                    <a:prstGeom prst="rect">
+                      <a:avLst/>
+                    </a:prstGeom>
+                  </pic:spPr>
+                </pic:pic>
+              </a:graphicData>
+            </a:graphic>
+          </wp:inline>
+        </w:drawing>
+      </w:r>
+    </w:p>
+    <w:p>
+      <w:r>
+        <w:rPr>
+          <w:noProof/>
+        </w:rPr>
+        <w:lastRenderedPageBreak/>
+        <w:t>And by finding the password, I completed this challenge!</w:t>
+      </w:r>
+      <w:r>
+        <w:t xml:space="preserve"> </w:t>
+      </w:r>
+    </w:p>
+    <w:p/>
     <w:sectPr>
       <w:pgSz w:w="12240" w:h="15840"/>
       <w:pgMar w:top="170" w:right="170" w:bottom="170" w:left="170" w:header="720" w:footer="720" w:gutter="0"/>

</xml_diff>